<commit_message>
fix: imagenes a 15.9 cm y bordes en el docx
</commit_message>
<xml_diff>
--- a/Informe_Laboratorio_3_2.docx
+++ b/Informe_Laboratorio_3_2.docx
@@ -14,187 +14,188 @@
         <w:t>Laboratorio #3.1:</w:t>
       </w:r>
     </w:p>
-    <w:p>
-      <w:pPr>
-        <w:pStyle w:val="BodyText"/>
-        <w:bidi w:val="0"/>
-        <w:spacing w:before="0" w:after="360"/>
-        <w:ind w:hanging="0" w:left="0" w:right="0"/>
-        <w:jc w:val="left"/>
-        <w:rPr>
-          <w:bdr w:val="single" w:sz="6" w:space="10" w:color="000000"/>
-        </w:rPr>
-      </w:pPr>
-      <w:r>
-        <w:rPr>
-          <w:b/>
-          <w:bdr w:val="single" w:sz="6" w:space="10" w:color="000000"/>
-        </w:rPr>
-        <w:t>Objetivos:</w:t>
-      </w:r>
-      <w:r>
-        <w:rPr>
-          <w:bdr w:val="single" w:sz="6" w:space="10" w:color="000000"/>
-        </w:rPr>
-        <w:t xml:space="preserve"> </w:t>
-      </w:r>
-    </w:p>
-    <w:p>
-      <w:pPr>
-        <w:pStyle w:val="BodyText"/>
-        <w:numPr>
-          <w:ilvl w:val="0"/>
-          <w:numId w:val="1"/>
-        </w:numPr>
-        <w:tabs>
-          <w:tab w:val="clear" w:pos="1134"/>
-          <w:tab w:val="left" w:pos="709" w:leader="none"/>
-        </w:tabs>
-        <w:bidi w:val="0"/>
-        <w:spacing w:before="0" w:after="360"/>
-        <w:ind w:hanging="283" w:left="709"/>
-        <w:jc w:val="left"/>
-        <w:rPr>
-          <w:bdr w:val="single" w:sz="6" w:space="10" w:color="000000"/>
-        </w:rPr>
-      </w:pPr>
-      <w:r>
-        <w:rPr>
-          <w:bdr w:val="single" w:sz="6" w:space="10" w:color="000000"/>
-        </w:rPr>
-        <w:t xml:space="preserve">Explicar qué es MCP y qué problema resuelve. </w:t>
-      </w:r>
-    </w:p>
-    <w:p>
-      <w:pPr>
-        <w:pStyle w:val="BodyText"/>
-        <w:numPr>
-          <w:ilvl w:val="0"/>
-          <w:numId w:val="1"/>
-        </w:numPr>
-        <w:tabs>
-          <w:tab w:val="clear" w:pos="1134"/>
-          <w:tab w:val="left" w:pos="709" w:leader="none"/>
-        </w:tabs>
-        <w:bidi w:val="0"/>
-        <w:spacing w:before="0" w:after="360"/>
-        <w:ind w:hanging="283" w:left="709"/>
-        <w:jc w:val="left"/>
-        <w:rPr>
-          <w:bdr w:val="single" w:sz="6" w:space="10" w:color="000000"/>
-        </w:rPr>
-      </w:pPr>
-      <w:r>
-        <w:rPr>
-          <w:bdr w:val="single" w:sz="6" w:space="10" w:color="000000"/>
-        </w:rPr>
-        <w:t xml:space="preserve">Configurar un servidor MCP desde el archivo de configuración (mcp.json, .mcp.json) en distintos asistentes de IA. </w:t>
-      </w:r>
-    </w:p>
-    <w:p>
-      <w:pPr>
-        <w:pStyle w:val="BodyText"/>
-        <w:numPr>
-          <w:ilvl w:val="0"/>
-          <w:numId w:val="1"/>
-        </w:numPr>
-        <w:tabs>
-          <w:tab w:val="clear" w:pos="1134"/>
-          <w:tab w:val="left" w:pos="709" w:leader="none"/>
-        </w:tabs>
-        <w:bidi w:val="0"/>
-        <w:spacing w:before="0" w:after="360"/>
-        <w:ind w:hanging="283" w:left="709"/>
-        <w:jc w:val="left"/>
-        <w:rPr>
-          <w:bdr w:val="single" w:sz="6" w:space="10" w:color="000000"/>
-        </w:rPr>
-      </w:pPr>
-      <w:r>
-        <w:rPr>
-          <w:bdr w:val="single" w:sz="6" w:space="10" w:color="000000"/>
-        </w:rPr>
-        <w:t xml:space="preserve">Verificar que el asistente detecta las herramientas (tools) que expone el servidor. </w:t>
-      </w:r>
-    </w:p>
-    <w:p>
-      <w:pPr>
-        <w:pStyle w:val="BodyText"/>
-        <w:numPr>
-          <w:ilvl w:val="0"/>
-          <w:numId w:val="1"/>
-        </w:numPr>
-        <w:tabs>
-          <w:tab w:val="clear" w:pos="1134"/>
-          <w:tab w:val="left" w:pos="709" w:leader="none"/>
-        </w:tabs>
-        <w:bidi w:val="0"/>
-        <w:spacing w:before="0" w:after="360"/>
-        <w:ind w:hanging="283" w:left="709"/>
-        <w:jc w:val="left"/>
-        <w:rPr>
-          <w:bdr w:val="single" w:sz="6" w:space="10" w:color="000000"/>
-        </w:rPr>
-      </w:pPr>
-      <w:r>
-        <w:rPr>
-          <w:bdr w:val="single" w:sz="6" w:space="10" w:color="000000"/>
-        </w:rPr>
-        <w:t xml:space="preserve">Usar Playwright MCP para que el agente explore un sitio web real: navegar, llenar formularios, capturar el DOM. </w:t>
-      </w:r>
-    </w:p>
-    <w:p>
-      <w:pPr>
-        <w:pStyle w:val="BodyText"/>
-        <w:numPr>
-          <w:ilvl w:val="0"/>
-          <w:numId w:val="1"/>
-        </w:numPr>
-        <w:tabs>
-          <w:tab w:val="clear" w:pos="1134"/>
-          <w:tab w:val="left" w:pos="709" w:leader="none"/>
-        </w:tabs>
-        <w:bidi w:val="0"/>
-        <w:spacing w:before="0" w:after="360"/>
-        <w:ind w:hanging="283" w:left="709"/>
-        <w:jc w:val="left"/>
-        <w:rPr>
-          <w:bdr w:val="single" w:sz="6" w:space="10" w:color="000000"/>
-        </w:rPr>
-      </w:pPr>
-      <w:r>
-        <w:rPr>
-          <w:bdr w:val="single" w:sz="6" w:space="10" w:color="000000"/>
-        </w:rPr>
-        <w:t xml:space="preserve">Generar pruebas E2E a partir de criterios de aceptación, con selectores y mensajes reales extraídos del sitio (no inventados). </w:t>
-      </w:r>
-    </w:p>
-    <w:p>
-      <w:pPr>
-        <w:pStyle w:val="BodyText"/>
-        <w:numPr>
-          <w:ilvl w:val="0"/>
-          <w:numId w:val="1"/>
-        </w:numPr>
-        <w:tabs>
-          <w:tab w:val="clear" w:pos="1134"/>
-          <w:tab w:val="left" w:pos="709" w:leader="none"/>
-        </w:tabs>
-        <w:bidi w:val="0"/>
-        <w:spacing w:before="0" w:after="360"/>
-        <w:ind w:hanging="283" w:left="709"/>
-        <w:jc w:val="left"/>
-        <w:rPr>
-          <w:bdr w:val="single" w:sz="6" w:space="10" w:color="000000"/>
-        </w:rPr>
-      </w:pPr>
-      <w:r>
-        <w:rPr>
-          <w:bdr w:val="single" w:sz="6" w:space="10" w:color="000000"/>
-        </w:rPr>
-        <w:t xml:space="preserve">Ejecutar las pruebas generadas y cerrar el ciclo: criterio → exploración → test → verde. </w:t>
-      </w:r>
-    </w:p>
+    <w:tbl>
+      <w:tblPr>
+        <w:tblW w:w="5000" w:type="pct"/>
+        <w:jc w:val="left"/>
+        <w:tblInd w:w="150" w:type="dxa"/>
+        <w:tblLayout w:type="fixed"/>
+        <w:tblCellMar>
+          <w:top w:w="150" w:type="dxa"/>
+          <w:left w:w="150" w:type="dxa"/>
+          <w:bottom w:w="150" w:type="dxa"/>
+          <w:right w:w="150" w:type="dxa"/>
+        </w:tblCellMar>
+      </w:tblPr>
+      <w:tblGrid>
+        <w:gridCol w:w="11339"/>
+      </w:tblGrid>
+      <w:tr>
+        <w:trPr/>
+        <w:tc>
+          <w:tcPr>
+            <w:tcW w:w="11339" w:type="dxa"/>
+            <w:tcBorders>
+              <w:top w:val="double" w:sz="2" w:space="0" w:color="808080"/>
+              <w:left w:val="double" w:sz="2" w:space="0" w:color="808080"/>
+              <w:bottom w:val="double" w:sz="2" w:space="0" w:color="808080"/>
+              <w:right w:val="double" w:sz="2" w:space="0" w:color="808080"/>
+            </w:tcBorders>
+            <w:vAlign w:val="center"/>
+          </w:tcPr>
+          <w:p>
+            <w:pPr>
+              <w:pStyle w:val="TableContents"/>
+              <w:bidi w:val="0"/>
+              <w:jc w:val="left"/>
+              <w:rPr/>
+            </w:pPr>
+            <w:r>
+              <w:rPr>
+                <w:b/>
+              </w:rPr>
+              <w:t>Objetivos:</w:t>
+            </w:r>
+            <w:r>
+              <w:rPr/>
+              <w:t xml:space="preserve"> </w:t>
+            </w:r>
+          </w:p>
+          <w:p>
+            <w:pPr>
+              <w:pStyle w:val="TableContents"/>
+              <w:numPr>
+                <w:ilvl w:val="0"/>
+                <w:numId w:val="1"/>
+              </w:numPr>
+              <w:tabs>
+                <w:tab w:val="clear" w:pos="1134"/>
+                <w:tab w:val="left" w:pos="709" w:leader="none"/>
+              </w:tabs>
+              <w:bidi w:val="0"/>
+              <w:spacing w:before="0" w:after="0"/>
+              <w:ind w:hanging="283" w:left="709"/>
+              <w:jc w:val="left"/>
+              <w:rPr/>
+            </w:pPr>
+            <w:r>
+              <w:rPr/>
+              <w:t xml:space="preserve">Explicar qué es MCP y qué problema resuelve. </w:t>
+            </w:r>
+          </w:p>
+          <w:p>
+            <w:pPr>
+              <w:pStyle w:val="TableContents"/>
+              <w:numPr>
+                <w:ilvl w:val="0"/>
+                <w:numId w:val="1"/>
+              </w:numPr>
+              <w:tabs>
+                <w:tab w:val="clear" w:pos="1134"/>
+                <w:tab w:val="left" w:pos="709" w:leader="none"/>
+              </w:tabs>
+              <w:bidi w:val="0"/>
+              <w:spacing w:before="0" w:after="0"/>
+              <w:ind w:hanging="283" w:left="709"/>
+              <w:jc w:val="left"/>
+              <w:rPr/>
+            </w:pPr>
+            <w:r>
+              <w:rPr/>
+              <w:t xml:space="preserve">Configurar un servidor MCP desde el archivo de configuración (mcp.json, .mcp.json) en distintos asistentes de IA. </w:t>
+            </w:r>
+          </w:p>
+          <w:p>
+            <w:pPr>
+              <w:pStyle w:val="TableContents"/>
+              <w:numPr>
+                <w:ilvl w:val="0"/>
+                <w:numId w:val="1"/>
+              </w:numPr>
+              <w:tabs>
+                <w:tab w:val="clear" w:pos="1134"/>
+                <w:tab w:val="left" w:pos="709" w:leader="none"/>
+              </w:tabs>
+              <w:bidi w:val="0"/>
+              <w:spacing w:before="0" w:after="0"/>
+              <w:ind w:hanging="283" w:left="709"/>
+              <w:jc w:val="left"/>
+              <w:rPr/>
+            </w:pPr>
+            <w:r>
+              <w:rPr/>
+              <w:t xml:space="preserve">Verificar que el asistente detecta las herramientas (tools) que expone el servidor. </w:t>
+            </w:r>
+          </w:p>
+          <w:p>
+            <w:pPr>
+              <w:pStyle w:val="TableContents"/>
+              <w:numPr>
+                <w:ilvl w:val="0"/>
+                <w:numId w:val="1"/>
+              </w:numPr>
+              <w:tabs>
+                <w:tab w:val="clear" w:pos="1134"/>
+                <w:tab w:val="left" w:pos="709" w:leader="none"/>
+              </w:tabs>
+              <w:bidi w:val="0"/>
+              <w:spacing w:before="0" w:after="0"/>
+              <w:ind w:hanging="283" w:left="709"/>
+              <w:jc w:val="left"/>
+              <w:rPr/>
+            </w:pPr>
+            <w:r>
+              <w:rPr/>
+              <w:t xml:space="preserve">Usar Playwright MCP para que el agente explore un sitio web real: navegar, llenar formularios, capturar el DOM. </w:t>
+            </w:r>
+          </w:p>
+          <w:p>
+            <w:pPr>
+              <w:pStyle w:val="TableContents"/>
+              <w:numPr>
+                <w:ilvl w:val="0"/>
+                <w:numId w:val="1"/>
+              </w:numPr>
+              <w:tabs>
+                <w:tab w:val="clear" w:pos="1134"/>
+                <w:tab w:val="left" w:pos="709" w:leader="none"/>
+              </w:tabs>
+              <w:bidi w:val="0"/>
+              <w:spacing w:before="0" w:after="0"/>
+              <w:ind w:hanging="283" w:left="709"/>
+              <w:jc w:val="left"/>
+              <w:rPr/>
+            </w:pPr>
+            <w:r>
+              <w:rPr/>
+              <w:t xml:space="preserve">Generar pruebas E2E a partir de criterios de aceptación, con selectores y mensajes reales extraídos del sitio (no inventados). </w:t>
+            </w:r>
+          </w:p>
+          <w:p>
+            <w:pPr>
+              <w:pStyle w:val="TableContents"/>
+              <w:numPr>
+                <w:ilvl w:val="0"/>
+                <w:numId w:val="1"/>
+              </w:numPr>
+              <w:tabs>
+                <w:tab w:val="clear" w:pos="1134"/>
+                <w:tab w:val="left" w:pos="709" w:leader="none"/>
+              </w:tabs>
+              <w:bidi w:val="0"/>
+              <w:spacing w:before="0" w:after="283"/>
+              <w:ind w:hanging="283" w:left="709"/>
+              <w:jc w:val="left"/>
+              <w:rPr/>
+            </w:pPr>
+            <w:r>
+              <w:rPr/>
+              <w:t xml:space="preserve">Ejecutar las pruebas generadas y cerrar el ciclo: criterio → exploración → test → verde. </w:t>
+            </w:r>
+          </w:p>
+        </w:tc>
+      </w:tr>
+    </w:tbl>
     <w:p>
       <w:pPr>
         <w:pStyle w:val="BodyText"/>
@@ -445,7 +446,7 @@
         <w:rPr/>
         <w:drawing>
           <wp:inline distT="0" distB="0" distL="0" distR="0">
-            <wp:extent cx="18669635" cy="12141835"/>
+            <wp:extent cx="5715000" cy="3714750"/>
             <wp:effectExtent l="0" t="0" r="0" b="0"/>
             <wp:docPr id="1" name="Image1"/>
             <wp:cNvGraphicFramePr>
@@ -469,7 +470,7 @@
                   <pic:spPr bwMode="auto">
                     <a:xfrm>
                       <a:off x="0" y="0"/>
-                      <a:ext cx="18669635" cy="12141835"/>
+                      <a:ext cx="5715000" cy="3714750"/>
                     </a:xfrm>
                     <a:prstGeom prst="rect">
                       <a:avLst/>
@@ -548,7 +549,7 @@
         <w:rPr/>
         <w:drawing>
           <wp:inline distT="0" distB="0" distL="0" distR="0">
-            <wp:extent cx="15494635" cy="9144635"/>
+            <wp:extent cx="5715000" cy="3371850"/>
             <wp:effectExtent l="0" t="0" r="0" b="0"/>
             <wp:docPr id="2" name="Image2"/>
             <wp:cNvGraphicFramePr>
@@ -572,7 +573,7 @@
                   <pic:spPr bwMode="auto">
                     <a:xfrm>
                       <a:off x="0" y="0"/>
-                      <a:ext cx="15494635" cy="9144635"/>
+                      <a:ext cx="5715000" cy="3371850"/>
                     </a:xfrm>
                     <a:prstGeom prst="rect">
                       <a:avLst/>
@@ -661,7 +662,7 @@
         <w:rPr/>
         <w:drawing>
           <wp:inline distT="0" distB="0" distL="0" distR="0">
-            <wp:extent cx="18669635" cy="12141835"/>
+            <wp:extent cx="5715000" cy="3714750"/>
             <wp:effectExtent l="0" t="0" r="0" b="0"/>
             <wp:docPr id="3" name="Image3"/>
             <wp:cNvGraphicFramePr>
@@ -685,7 +686,7 @@
                   <pic:spPr bwMode="auto">
                     <a:xfrm>
                       <a:off x="0" y="0"/>
-                      <a:ext cx="18669635" cy="12141835"/>
+                      <a:ext cx="5715000" cy="3714750"/>
                     </a:xfrm>
                     <a:prstGeom prst="rect">
                       <a:avLst/>
@@ -742,7 +743,7 @@
         <w:rPr/>
         <w:drawing>
           <wp:inline distT="0" distB="0" distL="0" distR="0">
-            <wp:extent cx="22860000" cy="14020800"/>
+            <wp:extent cx="5715000" cy="3505200"/>
             <wp:effectExtent l="0" t="0" r="0" b="0"/>
             <wp:docPr id="4" name="Image4"/>
             <wp:cNvGraphicFramePr>
@@ -766,7 +767,7 @@
                   <pic:spPr bwMode="auto">
                     <a:xfrm>
                       <a:off x="0" y="0"/>
-                      <a:ext cx="22860000" cy="14020800"/>
+                      <a:ext cx="5715000" cy="3505200"/>
                     </a:xfrm>
                     <a:prstGeom prst="rect">
                       <a:avLst/>
@@ -823,7 +824,7 @@
         <w:rPr/>
         <w:drawing>
           <wp:inline distT="0" distB="0" distL="0" distR="0">
-            <wp:extent cx="22860000" cy="14020800"/>
+            <wp:extent cx="5715000" cy="3505200"/>
             <wp:effectExtent l="0" t="0" r="0" b="0"/>
             <wp:docPr id="5" name="Image5"/>
             <wp:cNvGraphicFramePr>
@@ -847,7 +848,7 @@
                   <pic:spPr bwMode="auto">
                     <a:xfrm>
                       <a:off x="0" y="0"/>
-                      <a:ext cx="22860000" cy="14020800"/>
+                      <a:ext cx="5715000" cy="3505200"/>
                     </a:xfrm>
                     <a:prstGeom prst="rect">
                       <a:avLst/>
@@ -889,27 +890,32 @@
     </w:p>
     <w:tbl>
       <w:tblPr>
-        <w:tblW w:w="3906" w:type="dxa"/>
-        <w:jc w:val="left"/>
-        <w:tblInd w:w="737" w:type="dxa"/>
+        <w:tblW w:w="4034" w:type="dxa"/>
+        <w:jc w:val="left"/>
+        <w:tblInd w:w="769" w:type="dxa"/>
         <w:tblLayout w:type="fixed"/>
         <w:tblCellMar>
-          <w:top w:w="28" w:type="dxa"/>
-          <w:left w:w="28" w:type="dxa"/>
-          <w:bottom w:w="28" w:type="dxa"/>
-          <w:right w:w="28" w:type="dxa"/>
+          <w:top w:w="60" w:type="dxa"/>
+          <w:left w:w="60" w:type="dxa"/>
+          <w:bottom w:w="60" w:type="dxa"/>
+          <w:right w:w="60" w:type="dxa"/>
         </w:tblCellMar>
       </w:tblPr>
       <w:tblGrid>
-        <w:gridCol w:w="1460"/>
-        <w:gridCol w:w="2446"/>
+        <w:gridCol w:w="1524"/>
+        <w:gridCol w:w="2510"/>
       </w:tblGrid>
       <w:tr>
         <w:trPr/>
         <w:tc>
           <w:tcPr>
-            <w:tcW w:w="1460" w:type="dxa"/>
-            <w:tcBorders/>
+            <w:tcW w:w="1524" w:type="dxa"/>
+            <w:tcBorders>
+              <w:top w:val="double" w:sz="2" w:space="0" w:color="808080"/>
+              <w:left w:val="double" w:sz="2" w:space="0" w:color="808080"/>
+              <w:bottom w:val="double" w:sz="2" w:space="0" w:color="808080"/>
+              <w:right w:val="double" w:sz="2" w:space="0" w:color="808080"/>
+            </w:tcBorders>
             <w:vAlign w:val="center"/>
           </w:tcPr>
           <w:p>
@@ -929,8 +935,13 @@
         </w:tc>
         <w:tc>
           <w:tcPr>
-            <w:tcW w:w="2446" w:type="dxa"/>
-            <w:tcBorders/>
+            <w:tcW w:w="2510" w:type="dxa"/>
+            <w:tcBorders>
+              <w:top w:val="double" w:sz="2" w:space="0" w:color="808080"/>
+              <w:left w:val="double" w:sz="2" w:space="0" w:color="808080"/>
+              <w:bottom w:val="double" w:sz="2" w:space="0" w:color="808080"/>
+              <w:right w:val="double" w:sz="2" w:space="0" w:color="808080"/>
+            </w:tcBorders>
             <w:vAlign w:val="center"/>
           </w:tcPr>
           <w:p>
@@ -953,8 +964,12 @@
         <w:trPr/>
         <w:tc>
           <w:tcPr>
-            <w:tcW w:w="1460" w:type="dxa"/>
-            <w:tcBorders/>
+            <w:tcW w:w="1524" w:type="dxa"/>
+            <w:tcBorders>
+              <w:left w:val="double" w:sz="2" w:space="0" w:color="808080"/>
+              <w:bottom w:val="double" w:sz="2" w:space="0" w:color="808080"/>
+              <w:right w:val="double" w:sz="2" w:space="0" w:color="808080"/>
+            </w:tcBorders>
             <w:vAlign w:val="center"/>
           </w:tcPr>
           <w:p>
@@ -973,8 +988,12 @@
         </w:tc>
         <w:tc>
           <w:tcPr>
-            <w:tcW w:w="2446" w:type="dxa"/>
-            <w:tcBorders/>
+            <w:tcW w:w="2510" w:type="dxa"/>
+            <w:tcBorders>
+              <w:left w:val="double" w:sz="2" w:space="0" w:color="808080"/>
+              <w:bottom w:val="double" w:sz="2" w:space="0" w:color="808080"/>
+              <w:right w:val="double" w:sz="2" w:space="0" w:color="808080"/>
+            </w:tcBorders>
             <w:vAlign w:val="center"/>
           </w:tcPr>
           <w:p>
@@ -998,8 +1017,12 @@
         <w:trPr/>
         <w:tc>
           <w:tcPr>
-            <w:tcW w:w="1460" w:type="dxa"/>
-            <w:tcBorders/>
+            <w:tcW w:w="1524" w:type="dxa"/>
+            <w:tcBorders>
+              <w:left w:val="double" w:sz="2" w:space="0" w:color="808080"/>
+              <w:bottom w:val="double" w:sz="2" w:space="0" w:color="808080"/>
+              <w:right w:val="double" w:sz="2" w:space="0" w:color="808080"/>
+            </w:tcBorders>
             <w:vAlign w:val="center"/>
           </w:tcPr>
           <w:p>
@@ -1018,8 +1041,12 @@
         </w:tc>
         <w:tc>
           <w:tcPr>
-            <w:tcW w:w="2446" w:type="dxa"/>
-            <w:tcBorders/>
+            <w:tcW w:w="2510" w:type="dxa"/>
+            <w:tcBorders>
+              <w:left w:val="double" w:sz="2" w:space="0" w:color="808080"/>
+              <w:bottom w:val="double" w:sz="2" w:space="0" w:color="808080"/>
+              <w:right w:val="double" w:sz="2" w:space="0" w:color="808080"/>
+            </w:tcBorders>
             <w:vAlign w:val="center"/>
           </w:tcPr>
           <w:p>
@@ -1043,8 +1070,12 @@
         <w:trPr/>
         <w:tc>
           <w:tcPr>
-            <w:tcW w:w="1460" w:type="dxa"/>
-            <w:tcBorders/>
+            <w:tcW w:w="1524" w:type="dxa"/>
+            <w:tcBorders>
+              <w:left w:val="double" w:sz="2" w:space="0" w:color="808080"/>
+              <w:bottom w:val="double" w:sz="2" w:space="0" w:color="808080"/>
+              <w:right w:val="double" w:sz="2" w:space="0" w:color="808080"/>
+            </w:tcBorders>
             <w:vAlign w:val="center"/>
           </w:tcPr>
           <w:p>
@@ -1063,8 +1094,12 @@
         </w:tc>
         <w:tc>
           <w:tcPr>
-            <w:tcW w:w="2446" w:type="dxa"/>
-            <w:tcBorders/>
+            <w:tcW w:w="2510" w:type="dxa"/>
+            <w:tcBorders>
+              <w:left w:val="double" w:sz="2" w:space="0" w:color="808080"/>
+              <w:bottom w:val="double" w:sz="2" w:space="0" w:color="808080"/>
+              <w:right w:val="double" w:sz="2" w:space="0" w:color="808080"/>
+            </w:tcBorders>
             <w:vAlign w:val="center"/>
           </w:tcPr>
           <w:p>
@@ -1088,8 +1123,12 @@
         <w:trPr/>
         <w:tc>
           <w:tcPr>
-            <w:tcW w:w="1460" w:type="dxa"/>
-            <w:tcBorders/>
+            <w:tcW w:w="1524" w:type="dxa"/>
+            <w:tcBorders>
+              <w:left w:val="double" w:sz="2" w:space="0" w:color="808080"/>
+              <w:bottom w:val="double" w:sz="2" w:space="0" w:color="808080"/>
+              <w:right w:val="double" w:sz="2" w:space="0" w:color="808080"/>
+            </w:tcBorders>
             <w:vAlign w:val="center"/>
           </w:tcPr>
           <w:p>
@@ -1108,8 +1147,12 @@
         </w:tc>
         <w:tc>
           <w:tcPr>
-            <w:tcW w:w="2446" w:type="dxa"/>
-            <w:tcBorders/>
+            <w:tcW w:w="2510" w:type="dxa"/>
+            <w:tcBorders>
+              <w:left w:val="double" w:sz="2" w:space="0" w:color="808080"/>
+              <w:bottom w:val="double" w:sz="2" w:space="0" w:color="808080"/>
+              <w:right w:val="double" w:sz="2" w:space="0" w:color="808080"/>
+            </w:tcBorders>
             <w:vAlign w:val="center"/>
           </w:tcPr>
           <w:p>
@@ -1133,8 +1176,12 @@
         <w:trPr/>
         <w:tc>
           <w:tcPr>
-            <w:tcW w:w="1460" w:type="dxa"/>
-            <w:tcBorders/>
+            <w:tcW w:w="1524" w:type="dxa"/>
+            <w:tcBorders>
+              <w:left w:val="double" w:sz="2" w:space="0" w:color="808080"/>
+              <w:bottom w:val="double" w:sz="2" w:space="0" w:color="808080"/>
+              <w:right w:val="double" w:sz="2" w:space="0" w:color="808080"/>
+            </w:tcBorders>
             <w:vAlign w:val="center"/>
           </w:tcPr>
           <w:p>
@@ -1153,8 +1200,12 @@
         </w:tc>
         <w:tc>
           <w:tcPr>
-            <w:tcW w:w="2446" w:type="dxa"/>
-            <w:tcBorders/>
+            <w:tcW w:w="2510" w:type="dxa"/>
+            <w:tcBorders>
+              <w:left w:val="double" w:sz="2" w:space="0" w:color="808080"/>
+              <w:bottom w:val="double" w:sz="2" w:space="0" w:color="808080"/>
+              <w:right w:val="double" w:sz="2" w:space="0" w:color="808080"/>
+            </w:tcBorders>
             <w:vAlign w:val="center"/>
           </w:tcPr>
           <w:p>
@@ -1199,28 +1250,33 @@
     </w:p>
     <w:tbl>
       <w:tblPr>
-        <w:tblW w:w="6542" w:type="dxa"/>
-        <w:jc w:val="left"/>
-        <w:tblInd w:w="737" w:type="dxa"/>
+        <w:tblW w:w="6734" w:type="dxa"/>
+        <w:jc w:val="left"/>
+        <w:tblInd w:w="769" w:type="dxa"/>
         <w:tblLayout w:type="fixed"/>
         <w:tblCellMar>
-          <w:top w:w="28" w:type="dxa"/>
-          <w:left w:w="28" w:type="dxa"/>
-          <w:bottom w:w="28" w:type="dxa"/>
-          <w:right w:w="28" w:type="dxa"/>
+          <w:top w:w="60" w:type="dxa"/>
+          <w:left w:w="60" w:type="dxa"/>
+          <w:bottom w:w="60" w:type="dxa"/>
+          <w:right w:w="60" w:type="dxa"/>
         </w:tblCellMar>
       </w:tblPr>
       <w:tblGrid>
-        <w:gridCol w:w="1939"/>
-        <w:gridCol w:w="1138"/>
-        <w:gridCol w:w="3465"/>
+        <w:gridCol w:w="2003"/>
+        <w:gridCol w:w="1202"/>
+        <w:gridCol w:w="3529"/>
       </w:tblGrid>
       <w:tr>
         <w:trPr/>
         <w:tc>
           <w:tcPr>
-            <w:tcW w:w="1939" w:type="dxa"/>
-            <w:tcBorders/>
+            <w:tcW w:w="2003" w:type="dxa"/>
+            <w:tcBorders>
+              <w:top w:val="double" w:sz="2" w:space="0" w:color="808080"/>
+              <w:left w:val="double" w:sz="2" w:space="0" w:color="808080"/>
+              <w:bottom w:val="double" w:sz="2" w:space="0" w:color="808080"/>
+              <w:right w:val="double" w:sz="2" w:space="0" w:color="808080"/>
+            </w:tcBorders>
             <w:vAlign w:val="center"/>
           </w:tcPr>
           <w:p>
@@ -1240,8 +1296,13 @@
         </w:tc>
         <w:tc>
           <w:tcPr>
-            <w:tcW w:w="1138" w:type="dxa"/>
-            <w:tcBorders/>
+            <w:tcW w:w="1202" w:type="dxa"/>
+            <w:tcBorders>
+              <w:top w:val="double" w:sz="2" w:space="0" w:color="808080"/>
+              <w:left w:val="double" w:sz="2" w:space="0" w:color="808080"/>
+              <w:bottom w:val="double" w:sz="2" w:space="0" w:color="808080"/>
+              <w:right w:val="double" w:sz="2" w:space="0" w:color="808080"/>
+            </w:tcBorders>
             <w:vAlign w:val="center"/>
           </w:tcPr>
           <w:p>
@@ -1261,8 +1322,13 @@
         </w:tc>
         <w:tc>
           <w:tcPr>
-            <w:tcW w:w="3465" w:type="dxa"/>
-            <w:tcBorders/>
+            <w:tcW w:w="3529" w:type="dxa"/>
+            <w:tcBorders>
+              <w:top w:val="double" w:sz="2" w:space="0" w:color="808080"/>
+              <w:left w:val="double" w:sz="2" w:space="0" w:color="808080"/>
+              <w:bottom w:val="double" w:sz="2" w:space="0" w:color="808080"/>
+              <w:right w:val="double" w:sz="2" w:space="0" w:color="808080"/>
+            </w:tcBorders>
             <w:vAlign w:val="center"/>
           </w:tcPr>
           <w:p>
@@ -1285,8 +1351,12 @@
         <w:trPr/>
         <w:tc>
           <w:tcPr>
-            <w:tcW w:w="1939" w:type="dxa"/>
-            <w:tcBorders/>
+            <w:tcW w:w="2003" w:type="dxa"/>
+            <w:tcBorders>
+              <w:left w:val="double" w:sz="2" w:space="0" w:color="808080"/>
+              <w:bottom w:val="double" w:sz="2" w:space="0" w:color="808080"/>
+              <w:right w:val="double" w:sz="2" w:space="0" w:color="808080"/>
+            </w:tcBorders>
             <w:vAlign w:val="center"/>
           </w:tcPr>
           <w:p>
@@ -1305,8 +1375,12 @@
         </w:tc>
         <w:tc>
           <w:tcPr>
-            <w:tcW w:w="1138" w:type="dxa"/>
-            <w:tcBorders/>
+            <w:tcW w:w="1202" w:type="dxa"/>
+            <w:tcBorders>
+              <w:left w:val="double" w:sz="2" w:space="0" w:color="808080"/>
+              <w:bottom w:val="double" w:sz="2" w:space="0" w:color="808080"/>
+              <w:right w:val="double" w:sz="2" w:space="0" w:color="808080"/>
+            </w:tcBorders>
             <w:vAlign w:val="center"/>
           </w:tcPr>
           <w:p>
@@ -1325,8 +1399,12 @@
         </w:tc>
         <w:tc>
           <w:tcPr>
-            <w:tcW w:w="3465" w:type="dxa"/>
-            <w:tcBorders/>
+            <w:tcW w:w="3529" w:type="dxa"/>
+            <w:tcBorders>
+              <w:left w:val="double" w:sz="2" w:space="0" w:color="808080"/>
+              <w:bottom w:val="double" w:sz="2" w:space="0" w:color="808080"/>
+              <w:right w:val="double" w:sz="2" w:space="0" w:color="808080"/>
+            </w:tcBorders>
             <w:vAlign w:val="center"/>
           </w:tcPr>
           <w:p>
@@ -1348,8 +1426,12 @@
         <w:trPr/>
         <w:tc>
           <w:tcPr>
-            <w:tcW w:w="1939" w:type="dxa"/>
-            <w:tcBorders/>
+            <w:tcW w:w="2003" w:type="dxa"/>
+            <w:tcBorders>
+              <w:left w:val="double" w:sz="2" w:space="0" w:color="808080"/>
+              <w:bottom w:val="double" w:sz="2" w:space="0" w:color="808080"/>
+              <w:right w:val="double" w:sz="2" w:space="0" w:color="808080"/>
+            </w:tcBorders>
             <w:vAlign w:val="center"/>
           </w:tcPr>
           <w:p>
@@ -1368,8 +1450,12 @@
         </w:tc>
         <w:tc>
           <w:tcPr>
-            <w:tcW w:w="1138" w:type="dxa"/>
-            <w:tcBorders/>
+            <w:tcW w:w="1202" w:type="dxa"/>
+            <w:tcBorders>
+              <w:left w:val="double" w:sz="2" w:space="0" w:color="808080"/>
+              <w:bottom w:val="double" w:sz="2" w:space="0" w:color="808080"/>
+              <w:right w:val="double" w:sz="2" w:space="0" w:color="808080"/>
+            </w:tcBorders>
             <w:vAlign w:val="center"/>
           </w:tcPr>
           <w:p>
@@ -1388,8 +1474,12 @@
         </w:tc>
         <w:tc>
           <w:tcPr>
-            <w:tcW w:w="3465" w:type="dxa"/>
-            <w:tcBorders/>
+            <w:tcW w:w="3529" w:type="dxa"/>
+            <w:tcBorders>
+              <w:left w:val="double" w:sz="2" w:space="0" w:color="808080"/>
+              <w:bottom w:val="double" w:sz="2" w:space="0" w:color="808080"/>
+              <w:right w:val="double" w:sz="2" w:space="0" w:color="808080"/>
+            </w:tcBorders>
             <w:vAlign w:val="center"/>
           </w:tcPr>
           <w:p>
@@ -1411,8 +1501,12 @@
         <w:trPr/>
         <w:tc>
           <w:tcPr>
-            <w:tcW w:w="1939" w:type="dxa"/>
-            <w:tcBorders/>
+            <w:tcW w:w="2003" w:type="dxa"/>
+            <w:tcBorders>
+              <w:left w:val="double" w:sz="2" w:space="0" w:color="808080"/>
+              <w:bottom w:val="double" w:sz="2" w:space="0" w:color="808080"/>
+              <w:right w:val="double" w:sz="2" w:space="0" w:color="808080"/>
+            </w:tcBorders>
             <w:vAlign w:val="center"/>
           </w:tcPr>
           <w:p>
@@ -1431,8 +1525,12 @@
         </w:tc>
         <w:tc>
           <w:tcPr>
-            <w:tcW w:w="1138" w:type="dxa"/>
-            <w:tcBorders/>
+            <w:tcW w:w="1202" w:type="dxa"/>
+            <w:tcBorders>
+              <w:left w:val="double" w:sz="2" w:space="0" w:color="808080"/>
+              <w:bottom w:val="double" w:sz="2" w:space="0" w:color="808080"/>
+              <w:right w:val="double" w:sz="2" w:space="0" w:color="808080"/>
+            </w:tcBorders>
             <w:vAlign w:val="center"/>
           </w:tcPr>
           <w:p>
@@ -1451,8 +1549,12 @@
         </w:tc>
         <w:tc>
           <w:tcPr>
-            <w:tcW w:w="3465" w:type="dxa"/>
-            <w:tcBorders/>
+            <w:tcW w:w="3529" w:type="dxa"/>
+            <w:tcBorders>
+              <w:left w:val="double" w:sz="2" w:space="0" w:color="808080"/>
+              <w:bottom w:val="double" w:sz="2" w:space="0" w:color="808080"/>
+              <w:right w:val="double" w:sz="2" w:space="0" w:color="808080"/>
+            </w:tcBorders>
             <w:vAlign w:val="center"/>
           </w:tcPr>
           <w:p>
@@ -1474,8 +1576,12 @@
         <w:trPr/>
         <w:tc>
           <w:tcPr>
-            <w:tcW w:w="1939" w:type="dxa"/>
-            <w:tcBorders/>
+            <w:tcW w:w="2003" w:type="dxa"/>
+            <w:tcBorders>
+              <w:left w:val="double" w:sz="2" w:space="0" w:color="808080"/>
+              <w:bottom w:val="double" w:sz="2" w:space="0" w:color="808080"/>
+              <w:right w:val="double" w:sz="2" w:space="0" w:color="808080"/>
+            </w:tcBorders>
             <w:vAlign w:val="center"/>
           </w:tcPr>
           <w:p>
@@ -1494,8 +1600,12 @@
         </w:tc>
         <w:tc>
           <w:tcPr>
-            <w:tcW w:w="1138" w:type="dxa"/>
-            <w:tcBorders/>
+            <w:tcW w:w="1202" w:type="dxa"/>
+            <w:tcBorders>
+              <w:left w:val="double" w:sz="2" w:space="0" w:color="808080"/>
+              <w:bottom w:val="double" w:sz="2" w:space="0" w:color="808080"/>
+              <w:right w:val="double" w:sz="2" w:space="0" w:color="808080"/>
+            </w:tcBorders>
             <w:vAlign w:val="center"/>
           </w:tcPr>
           <w:p>
@@ -1514,8 +1624,12 @@
         </w:tc>
         <w:tc>
           <w:tcPr>
-            <w:tcW w:w="3465" w:type="dxa"/>
-            <w:tcBorders/>
+            <w:tcW w:w="3529" w:type="dxa"/>
+            <w:tcBorders>
+              <w:left w:val="double" w:sz="2" w:space="0" w:color="808080"/>
+              <w:bottom w:val="double" w:sz="2" w:space="0" w:color="808080"/>
+              <w:right w:val="double" w:sz="2" w:space="0" w:color="808080"/>
+            </w:tcBorders>
             <w:vAlign w:val="center"/>
           </w:tcPr>
           <w:p>
@@ -1605,11 +1719,20 @@
         <w:rPr/>
         <w:t xml:space="preserve">Captura de la ejecución npx playwright test con los 4 tests en verde (4 passed). </w:t>
       </w:r>
+    </w:p>
+    <w:p>
+      <w:pPr>
+        <w:pStyle w:val="BodyText"/>
+        <w:bidi w:val="0"/>
+        <w:spacing w:before="0" w:after="283"/>
+        <w:jc w:val="left"/>
+        <w:rPr/>
+      </w:pPr>
       <w:r>
         <w:rPr/>
         <w:drawing>
           <wp:inline distT="0" distB="0" distL="0" distR="0">
-            <wp:extent cx="14224635" cy="5842000"/>
+            <wp:extent cx="5715000" cy="2343150"/>
             <wp:effectExtent l="0" t="0" r="0" b="0"/>
             <wp:docPr id="6" name="Image6"/>
             <wp:cNvGraphicFramePr>
@@ -1633,7 +1756,7 @@
                   <pic:spPr bwMode="auto">
                     <a:xfrm>
                       <a:off x="0" y="0"/>
-                      <a:ext cx="14224635" cy="5842000"/>
+                      <a:ext cx="5715000" cy="2343150"/>
                     </a:xfrm>
                     <a:prstGeom prst="rect">
                       <a:avLst/>
@@ -1645,10 +1768,6 @@
             </a:graphic>
           </wp:inline>
         </w:drawing>
-      </w:r>
-      <w:r>
-        <w:rPr/>
-        <w:t xml:space="preserve"> </w:t>
       </w:r>
     </w:p>
     <w:sectPr>

</xml_diff>

<commit_message>
fix: ancho fijo del recuadro de objetivos para Google Docs
</commit_message>
<xml_diff>
--- a/Informe_Laboratorio_3_2.docx
+++ b/Informe_Laboratorio_3_2.docx
@@ -16,7 +16,7 @@
     </w:p>
     <w:tbl>
       <w:tblPr>
-        <w:tblW w:w="5000" w:type="pct"/>
+        <w:tblW w:w="9000" w:type="dxa"/>
         <w:jc w:val="left"/>
         <w:tblInd w:w="150" w:type="dxa"/>
         <w:tblLayout w:type="fixed"/>
@@ -28,13 +28,13 @@
         </w:tblCellMar>
       </w:tblPr>
       <w:tblGrid>
-        <w:gridCol w:w="11339"/>
+        <w:gridCol w:w="9000"/>
       </w:tblGrid>
       <w:tr>
         <w:trPr/>
         <w:tc>
           <w:tcPr>
-            <w:tcW w:w="11339" w:type="dxa"/>
+            <w:tcW w:w="9000" w:type="dxa"/>
             <w:tcBorders>
               <w:top w:val="double" w:sz="2" w:space="0" w:color="808080"/>
               <w:left w:val="double" w:sz="2" w:space="0" w:color="808080"/>

</xml_diff>